<commit_message>
Use Word's built-in Heading 1/2 styles (outline levels) for section headings
</commit_message>
<xml_diff>
--- a/assets/manuscript-template.docx
+++ b/assets/manuscript-template.docx
@@ -470,16 +470,17 @@
     <w:pPr>
       <w:keepNext/>
       <w:keepLines/>
-      <w:spacing w:before="480" w:after="0"/>
+      <w:spacing w:before="360" w:after="120" w:line="360" w:lineRule="auto"/>
+      <w:ind w:firstLine="0"/>
+      <w:jc w:val="left"/>
       <w:outlineLvl w:val="0"/>
     </w:pPr>
     <w:rPr>
-      <w:rFonts w:asciiTheme="majorHAnsi" w:eastAsiaTheme="majorEastAsia" w:hAnsiTheme="majorHAnsi" w:cstheme="majorBidi"/>
+      <w:rFonts w:ascii="Arial" w:hAnsi="Arial" w:cs="Arial" w:eastAsia="SimSun"/>
       <w:b/>
       <w:bCs/>
-      <w:color w:val="365F91" w:themeColor="accent1" w:themeShade="BF"/>
+      <w:i w:val="0"/>
       <w:sz w:val="28"/>
-      <w:szCs w:val="28"/>
     </w:rPr>
   </w:style>
   <w:style w:type="paragraph" w:styleId="Heading2">
@@ -494,16 +495,17 @@
     <w:pPr>
       <w:keepNext/>
       <w:keepLines/>
-      <w:spacing w:before="200" w:after="0"/>
+      <w:spacing w:before="0" w:after="0" w:line="360" w:lineRule="auto"/>
+      <w:ind w:firstLine="0"/>
+      <w:jc w:val="left"/>
       <w:outlineLvl w:val="1"/>
     </w:pPr>
     <w:rPr>
-      <w:rFonts w:asciiTheme="majorHAnsi" w:eastAsiaTheme="majorEastAsia" w:hAnsiTheme="majorHAnsi" w:cstheme="majorBidi"/>
-      <w:b/>
+      <w:rFonts w:ascii="Times New Roman" w:hAnsi="Times New Roman" w:cs="Times New Roman" w:eastAsia="SimSun"/>
+      <w:b w:val="0"/>
       <w:bCs/>
-      <w:color w:val="4F81BD" w:themeColor="accent1"/>
-      <w:sz w:val="26"/>
-      <w:szCs w:val="26"/>
+      <w:i/>
+      <w:sz w:val="24"/>
     </w:rPr>
   </w:style>
   <w:style w:type="paragraph" w:styleId="Heading3">
@@ -12217,6 +12219,7 @@
       <w:spacing w:line="360" w:lineRule="auto" w:before="360" w:after="120"/>
       <w:ind w:firstLine="0"/>
       <w:jc w:val="left"/>
+      <w:outlineLvl w:val="0"/>
     </w:pPr>
     <w:rPr>
       <w:rFonts w:ascii="Arial" w:hAnsi="Arial" w:cs="Arial" w:eastAsia="SimSun"/>
@@ -12233,6 +12236,7 @@
       <w:spacing w:line="360" w:lineRule="auto" w:before="0" w:after="0"/>
       <w:ind w:firstLine="0"/>
       <w:jc w:val="left"/>
+      <w:outlineLvl w:val="1"/>
     </w:pPr>
     <w:rPr>
       <w:rFonts w:ascii="Times New Roman" w:hAnsi="Times New Roman" w:cs="Times New Roman" w:eastAsia="SimSun"/>

</xml_diff>